<commit_message>
new structure of functions
</commit_message>
<xml_diff>
--- a/template_inv.docx
+++ b/template_inv.docx
@@ -283,8 +283,8 @@
               <w:rPr>
                 <w:b/>
                 <w:bCs/>
-                <w:sz w:val="20"/>
-                <w:szCs w:val="20"/>
+                <w:sz w:val="21"/>
+                <w:szCs w:val="21"/>
               </w:rPr>
             </w:r>
           </w:p>
@@ -312,8 +312,8 @@
               <w:rPr>
                 <w:b/>
                 <w:bCs/>
-                <w:sz w:val="20"/>
-                <w:szCs w:val="20"/>
+                <w:sz w:val="21"/>
+                <w:szCs w:val="21"/>
               </w:rPr>
             </w:r>
           </w:p>
@@ -339,8 +339,8 @@
             </w:pPr>
             <w:r>
               <w:rPr>
-                <w:sz w:val="20"/>
-                <w:szCs w:val="20"/>
+                <w:sz w:val="21"/>
+                <w:szCs w:val="21"/>
               </w:rPr>
             </w:r>
           </w:p>
@@ -368,8 +368,8 @@
               <w:rPr>
                 <w:b/>
                 <w:bCs/>
-                <w:sz w:val="20"/>
-                <w:szCs w:val="20"/>
+                <w:sz w:val="21"/>
+                <w:szCs w:val="21"/>
               </w:rPr>
             </w:r>
           </w:p>
@@ -395,8 +395,8 @@
             </w:pPr>
             <w:r>
               <w:rPr>
-                <w:sz w:val="20"/>
-                <w:szCs w:val="20"/>
+                <w:sz w:val="21"/>
+                <w:szCs w:val="21"/>
               </w:rPr>
             </w:r>
           </w:p>
@@ -419,8 +419,8 @@
             </w:pPr>
             <w:r>
               <w:rPr>
-                <w:sz w:val="20"/>
-                <w:szCs w:val="20"/>
+                <w:sz w:val="21"/>
+                <w:szCs w:val="21"/>
               </w:rPr>
             </w:r>
           </w:p>
@@ -446,8 +446,8 @@
             </w:pPr>
             <w:r>
               <w:rPr>
-                <w:sz w:val="20"/>
-                <w:szCs w:val="20"/>
+                <w:sz w:val="21"/>
+                <w:szCs w:val="21"/>
               </w:rPr>
             </w:r>
           </w:p>
@@ -470,8 +470,8 @@
             </w:pPr>
             <w:r>
               <w:rPr>
-                <w:sz w:val="20"/>
-                <w:szCs w:val="20"/>
+                <w:sz w:val="21"/>
+                <w:szCs w:val="21"/>
               </w:rPr>
             </w:r>
           </w:p>
@@ -497,8 +497,8 @@
             </w:pPr>
             <w:r>
               <w:rPr>
-                <w:sz w:val="20"/>
-                <w:szCs w:val="20"/>
+                <w:sz w:val="21"/>
+                <w:szCs w:val="21"/>
               </w:rPr>
             </w:r>
           </w:p>
@@ -521,8 +521,8 @@
             </w:pPr>
             <w:r>
               <w:rPr>
-                <w:sz w:val="20"/>
-                <w:szCs w:val="20"/>
+                <w:sz w:val="21"/>
+                <w:szCs w:val="21"/>
               </w:rPr>
             </w:r>
           </w:p>
@@ -548,8 +548,8 @@
             </w:pPr>
             <w:r>
               <w:rPr>
-                <w:sz w:val="20"/>
-                <w:szCs w:val="20"/>
+                <w:sz w:val="21"/>
+                <w:szCs w:val="21"/>
               </w:rPr>
             </w:r>
           </w:p>
@@ -1218,7 +1218,7 @@
                 <w:sz w:val="20"/>
                 <w:szCs w:val="20"/>
               </w:rPr>
-              <w:t>0,00</w:t>
+              <w:t>0.00</w:t>
             </w:r>
           </w:p>
         </w:tc>
@@ -1936,7 +1936,7 @@
                 <w:sz w:val="20"/>
                 <w:szCs w:val="20"/>
               </w:rPr>
-              <w:t>0,00 PLN</w:t>
+              <w:t>0.00 PLN</w:t>
             </w:r>
           </w:p>
         </w:tc>
@@ -1989,8 +1989,8 @@
               <w:rPr>
                 <w:b/>
                 <w:bCs/>
-                <w:sz w:val="20"/>
-                <w:szCs w:val="20"/>
+                <w:sz w:val="21"/>
+                <w:szCs w:val="21"/>
               </w:rPr>
             </w:r>
           </w:p>
@@ -2085,8 +2085,8 @@
               <w:rPr>
                 <w:b/>
                 <w:bCs/>
-                <w:sz w:val="20"/>
-                <w:szCs w:val="20"/>
+                <w:sz w:val="21"/>
+                <w:szCs w:val="21"/>
               </w:rPr>
             </w:r>
             <w:bookmarkStart w:id="0" w:name="__DdeLink__212_3921750545"/>
@@ -2247,15 +2247,15 @@
         </w:tblCellMar>
       </w:tblPr>
       <w:tblGrid>
-        <w:gridCol w:w="4533"/>
-        <w:gridCol w:w="791"/>
+        <w:gridCol w:w="4532"/>
+        <w:gridCol w:w="792"/>
         <w:gridCol w:w="4314"/>
       </w:tblGrid>
       <w:tr>
         <w:trPr/>
         <w:tc>
           <w:tcPr>
-            <w:tcW w:w="4533" w:type="dxa"/>
+            <w:tcW w:w="4532" w:type="dxa"/>
             <w:tcBorders/>
             <w:shd w:fill="auto" w:val="clear"/>
           </w:tcPr>
@@ -2280,7 +2280,7 @@
         </w:tc>
         <w:tc>
           <w:tcPr>
-            <w:tcW w:w="791" w:type="dxa"/>
+            <w:tcW w:w="792" w:type="dxa"/>
             <w:vMerge w:val="restart"/>
             <w:tcBorders/>
             <w:shd w:fill="auto" w:val="clear"/>
@@ -2320,7 +2320,7 @@
         <w:trPr/>
         <w:tc>
           <w:tcPr>
-            <w:tcW w:w="4533" w:type="dxa"/>
+            <w:tcW w:w="4532" w:type="dxa"/>
             <w:tcBorders/>
             <w:shd w:fill="auto" w:val="clear"/>
           </w:tcPr>
@@ -2339,7 +2339,7 @@
         </w:tc>
         <w:tc>
           <w:tcPr>
-            <w:tcW w:w="791" w:type="dxa"/>
+            <w:tcW w:w="792" w:type="dxa"/>
             <w:vMerge w:val="continue"/>
             <w:tcBorders/>
             <w:shd w:fill="auto" w:val="clear"/>

</xml_diff>